<commit_message>
Actualiza descripción del proyecto
</commit_message>
<xml_diff>
--- a/Documentacion/Descripción del Proyecto.docx
+++ b/Documentacion/Descripción del Proyecto.docx
@@ -47,23 +47,8 @@
           <w:bCs/>
           <w:lang w:val="es-CO"/>
         </w:rPr>
-        <w:t xml:space="preserve">Autor:  </w:t>
-      </w:r>
-      <w:r>
-        <w:rPr>
-          <w:rFonts w:ascii="Arial" w:hAnsi="Arial" w:cs="Arial"/>
-          <w:lang w:val="es-CO"/>
-        </w:rPr>
-        <w:t>Luis Fernando Martínez Muñoz</w:t>
-      </w:r>
-    </w:p>
-    <w:p>
-      <w:pPr>
-        <w:rPr>
-          <w:rFonts w:ascii="Arial" w:hAnsi="Arial" w:cs="Arial"/>
-          <w:lang w:val="es-CO"/>
-        </w:rPr>
-      </w:pPr>
+        <w:t>Colaboradores</w:t>
+      </w:r>
       <w:r>
         <w:rPr>
           <w:rFonts w:ascii="Arial" w:hAnsi="Arial" w:cs="Arial"/>
@@ -71,14 +56,14 @@
           <w:bCs/>
           <w:lang w:val="es-CO"/>
         </w:rPr>
-        <w:t xml:space="preserve">Fecha de creación: </w:t>
-      </w:r>
-      <w:r>
-        <w:rPr>
-          <w:rFonts w:ascii="Arial" w:hAnsi="Arial" w:cs="Arial"/>
-          <w:lang w:val="es-CO"/>
-        </w:rPr>
-        <w:t>23 de febrero de 2025</w:t>
+        <w:t xml:space="preserve">:  </w:t>
+      </w:r>
+      <w:r>
+        <w:rPr>
+          <w:rFonts w:ascii="Arial" w:hAnsi="Arial" w:cs="Arial"/>
+          <w:lang w:val="es-CO"/>
+        </w:rPr>
+        <w:t>Luis Fernando Martínez Muñoz</w:t>
       </w:r>
     </w:p>
     <w:p>
@@ -95,7 +80,7 @@
           <w:bCs/>
           <w:lang w:val="es-CO"/>
         </w:rPr>
-        <w:t xml:space="preserve">Fecha de actualización: </w:t>
+        <w:t xml:space="preserve">Fecha de creación: </w:t>
       </w:r>
       <w:r>
         <w:rPr>
@@ -112,213 +97,276 @@
           <w:lang w:val="es-CO"/>
         </w:rPr>
       </w:pPr>
-    </w:p>
-    <w:p>
-      <w:pPr>
+      <w:r>
         <w:rPr>
           <w:rFonts w:ascii="Arial" w:hAnsi="Arial" w:cs="Arial"/>
           <w:b/>
           <w:bCs/>
           <w:lang w:val="es-CO"/>
         </w:rPr>
-      </w:pPr>
-      <w:r>
+        <w:t xml:space="preserve">Fecha de actualización: </w:t>
+      </w:r>
+      <w:r>
+        <w:rPr>
+          <w:rFonts w:ascii="Arial" w:hAnsi="Arial" w:cs="Arial"/>
+          <w:lang w:val="es-CO"/>
+        </w:rPr>
+        <w:t>2</w:t>
+      </w:r>
+      <w:r>
+        <w:rPr>
+          <w:rFonts w:ascii="Arial" w:hAnsi="Arial" w:cs="Arial"/>
+          <w:lang w:val="es-CO"/>
+        </w:rPr>
+        <w:t>4</w:t>
+      </w:r>
+      <w:r>
+        <w:rPr>
+          <w:rFonts w:ascii="Arial" w:hAnsi="Arial" w:cs="Arial"/>
+          <w:lang w:val="es-CO"/>
+        </w:rPr>
+        <w:t xml:space="preserve"> de febrero de 2025</w:t>
+      </w:r>
+    </w:p>
+    <w:p>
+      <w:pPr>
+        <w:rPr>
+          <w:rFonts w:ascii="Arial" w:hAnsi="Arial" w:cs="Arial"/>
+          <w:lang w:val="es-CO"/>
+        </w:rPr>
+      </w:pPr>
+    </w:p>
+    <w:p>
+      <w:pPr>
         <w:rPr>
           <w:rFonts w:ascii="Arial" w:hAnsi="Arial" w:cs="Arial"/>
           <w:b/>
           <w:bCs/>
           <w:lang w:val="es-CO"/>
         </w:rPr>
-        <w:t>Introducción</w:t>
-      </w:r>
-    </w:p>
-    <w:p>
-      <w:pPr>
-        <w:rPr>
-          <w:rFonts w:ascii="Arial" w:hAnsi="Arial" w:cs="Arial"/>
-          <w:lang w:val="es-CO"/>
-        </w:rPr>
-      </w:pPr>
-      <w:r>
-        <w:rPr>
-          <w:rFonts w:ascii="Arial" w:hAnsi="Arial" w:cs="Arial"/>
-          <w:lang w:val="es-CO"/>
-        </w:rPr>
-        <w:t>Durante el año 2018 se llevó al cabo el Censo Nacional de Población y Vivienda en Colombia, el cual “</w:t>
-      </w:r>
-      <w:r>
-        <w:rPr>
-          <w:rFonts w:ascii="Arial" w:hAnsi="Arial" w:cs="Arial"/>
-          <w:lang w:val="es-CO"/>
-        </w:rPr>
-        <w:t>consistió en contar y caracterizar las personas residentes en Colombia, así como las viviendas y los hogares del territorio nacional</w:t>
-      </w:r>
-      <w:r>
-        <w:rPr>
-          <w:rFonts w:ascii="Arial" w:hAnsi="Arial" w:cs="Arial"/>
-          <w:lang w:val="es-CO"/>
-        </w:rPr>
-        <w:t>” [Dane, 2018].</w:t>
-      </w:r>
-    </w:p>
-    <w:p>
-      <w:pPr>
-        <w:rPr>
-          <w:rFonts w:ascii="Arial" w:hAnsi="Arial" w:cs="Arial"/>
-          <w:lang w:val="es-CO"/>
-        </w:rPr>
-      </w:pPr>
-      <w:r>
-        <w:rPr>
-          <w:rFonts w:ascii="Arial" w:hAnsi="Arial" w:cs="Arial"/>
-          <w:lang w:val="es-CO"/>
-        </w:rPr>
-        <w:t>Dicho censo no solo contó el número de personas en el país, también recolectó datos de dónde y cómo viven sus ciudadanos.</w:t>
-      </w:r>
-    </w:p>
-    <w:p>
-      <w:pPr>
-        <w:rPr>
-          <w:rFonts w:ascii="Arial" w:hAnsi="Arial" w:cs="Arial"/>
-          <w:lang w:val="es-CO"/>
-        </w:rPr>
-      </w:pPr>
-    </w:p>
-    <w:p>
-      <w:pPr>
+      </w:pPr>
+      <w:r>
         <w:rPr>
           <w:rFonts w:ascii="Arial" w:hAnsi="Arial" w:cs="Arial"/>
           <w:b/>
           <w:bCs/>
           <w:lang w:val="es-CO"/>
         </w:rPr>
-      </w:pPr>
-      <w:r>
+        <w:t>Introducción</w:t>
+      </w:r>
+    </w:p>
+    <w:p>
+      <w:pPr>
+        <w:rPr>
+          <w:rFonts w:ascii="Arial" w:hAnsi="Arial" w:cs="Arial"/>
+          <w:lang w:val="es-CO"/>
+        </w:rPr>
+      </w:pPr>
+      <w:r>
+        <w:rPr>
+          <w:rFonts w:ascii="Arial" w:hAnsi="Arial" w:cs="Arial"/>
+          <w:lang w:val="es-CO"/>
+        </w:rPr>
+        <w:t>Durante el año 2018 se llevó al cabo el Censo Nacional de Población y Vivienda en Colombia, el cual “</w:t>
+      </w:r>
+      <w:r>
+        <w:rPr>
+          <w:rFonts w:ascii="Arial" w:hAnsi="Arial" w:cs="Arial"/>
+          <w:lang w:val="es-CO"/>
+        </w:rPr>
+        <w:t>consistió en contar y caracterizar las personas residentes en Colombia, así como las viviendas y los hogares del territorio nacional</w:t>
+      </w:r>
+      <w:r>
+        <w:rPr>
+          <w:rFonts w:ascii="Arial" w:hAnsi="Arial" w:cs="Arial"/>
+          <w:lang w:val="es-CO"/>
+        </w:rPr>
+        <w:t>” [</w:t>
+      </w:r>
+      <w:proofErr w:type="spellStart"/>
+      <w:r>
+        <w:rPr>
+          <w:rFonts w:ascii="Arial" w:hAnsi="Arial" w:cs="Arial"/>
+          <w:lang w:val="es-CO"/>
+        </w:rPr>
+        <w:t>Dane</w:t>
+      </w:r>
+      <w:proofErr w:type="spellEnd"/>
+      <w:r>
+        <w:rPr>
+          <w:rFonts w:ascii="Arial" w:hAnsi="Arial" w:cs="Arial"/>
+          <w:lang w:val="es-CO"/>
+        </w:rPr>
+        <w:t>, 2018].</w:t>
+      </w:r>
+    </w:p>
+    <w:p>
+      <w:pPr>
+        <w:rPr>
+          <w:rFonts w:ascii="Arial" w:hAnsi="Arial" w:cs="Arial"/>
+          <w:lang w:val="es-CO"/>
+        </w:rPr>
+      </w:pPr>
+      <w:r>
+        <w:rPr>
+          <w:rFonts w:ascii="Arial" w:hAnsi="Arial" w:cs="Arial"/>
+          <w:lang w:val="es-CO"/>
+        </w:rPr>
+        <w:t>Dicho censo no solo contó el número de personas en el país, también recolectó datos de dónde y cómo viven sus ciudadanos.</w:t>
+      </w:r>
+    </w:p>
+    <w:p>
+      <w:pPr>
+        <w:rPr>
+          <w:rFonts w:ascii="Arial" w:hAnsi="Arial" w:cs="Arial"/>
+          <w:lang w:val="es-CO"/>
+        </w:rPr>
+      </w:pPr>
+    </w:p>
+    <w:p>
+      <w:pPr>
         <w:rPr>
           <w:rFonts w:ascii="Arial" w:hAnsi="Arial" w:cs="Arial"/>
           <w:b/>
           <w:bCs/>
           <w:lang w:val="es-CO"/>
         </w:rPr>
-        <w:t>Objetivo</w:t>
-      </w:r>
-    </w:p>
-    <w:p>
-      <w:pPr>
-        <w:rPr>
-          <w:rFonts w:ascii="Arial" w:hAnsi="Arial" w:cs="Arial"/>
-          <w:lang w:val="es-CO"/>
-        </w:rPr>
-      </w:pPr>
-      <w:r>
-        <w:rPr>
-          <w:rFonts w:ascii="Arial" w:hAnsi="Arial" w:cs="Arial"/>
-          <w:lang w:val="es-CO"/>
-        </w:rPr>
-        <w:t>Construir un</w:t>
-      </w:r>
-      <w:r>
-        <w:rPr>
-          <w:rFonts w:ascii="Arial" w:hAnsi="Arial" w:cs="Arial"/>
-          <w:lang w:val="es-CO"/>
-        </w:rPr>
-        <w:t>o o varios</w:t>
-      </w:r>
-      <w:r>
-        <w:rPr>
-          <w:rFonts w:ascii="Arial" w:hAnsi="Arial" w:cs="Arial"/>
-          <w:lang w:val="es-CO"/>
-        </w:rPr>
-        <w:t xml:space="preserve"> dataset</w:t>
-      </w:r>
-      <w:r>
-        <w:rPr>
-          <w:rFonts w:ascii="Arial" w:hAnsi="Arial" w:cs="Arial"/>
-          <w:lang w:val="es-CO"/>
-        </w:rPr>
-        <w:t>, según sea necesario,</w:t>
-      </w:r>
-      <w:r>
-        <w:rPr>
-          <w:rFonts w:ascii="Arial" w:hAnsi="Arial" w:cs="Arial"/>
-          <w:lang w:val="es-CO"/>
-        </w:rPr>
-        <w:t xml:space="preserve"> a partir de los datos suministrados por el Departamento Nacional de Estadística (DANE), que contenga solo la información correspondiente al municipio de Viterbo, Caldas</w:t>
-      </w:r>
-      <w:r>
-        <w:rPr>
-          <w:rFonts w:ascii="Arial" w:hAnsi="Arial" w:cs="Arial"/>
-          <w:lang w:val="es-CO"/>
-        </w:rPr>
-        <w:t>.</w:t>
-      </w:r>
-    </w:p>
-    <w:p>
-      <w:pPr>
-        <w:rPr>
-          <w:rFonts w:ascii="Arial" w:hAnsi="Arial" w:cs="Arial"/>
-          <w:lang w:val="es-CO"/>
-        </w:rPr>
-      </w:pPr>
-    </w:p>
-    <w:p>
-      <w:pPr>
+      </w:pPr>
+      <w:r>
         <w:rPr>
           <w:rFonts w:ascii="Arial" w:hAnsi="Arial" w:cs="Arial"/>
           <w:b/>
           <w:bCs/>
           <w:lang w:val="es-CO"/>
         </w:rPr>
-      </w:pPr>
-      <w:r>
+        <w:t>Objetivo</w:t>
+      </w:r>
+    </w:p>
+    <w:p>
+      <w:pPr>
+        <w:rPr>
+          <w:rFonts w:ascii="Arial" w:hAnsi="Arial" w:cs="Arial"/>
+          <w:lang w:val="es-CO"/>
+        </w:rPr>
+      </w:pPr>
+      <w:r>
+        <w:rPr>
+          <w:rFonts w:ascii="Arial" w:hAnsi="Arial" w:cs="Arial"/>
+          <w:lang w:val="es-CO"/>
+        </w:rPr>
+        <w:t>Construir un</w:t>
+      </w:r>
+      <w:r>
+        <w:rPr>
+          <w:rFonts w:ascii="Arial" w:hAnsi="Arial" w:cs="Arial"/>
+          <w:lang w:val="es-CO"/>
+        </w:rPr>
+        <w:t>o o varios</w:t>
+      </w:r>
+      <w:r>
+        <w:rPr>
+          <w:rFonts w:ascii="Arial" w:hAnsi="Arial" w:cs="Arial"/>
+          <w:lang w:val="es-CO"/>
+        </w:rPr>
+        <w:t xml:space="preserve"> </w:t>
+      </w:r>
+      <w:proofErr w:type="spellStart"/>
+      <w:r>
+        <w:rPr>
+          <w:rFonts w:ascii="Arial" w:hAnsi="Arial" w:cs="Arial"/>
+          <w:lang w:val="es-CO"/>
+        </w:rPr>
+        <w:t>dataset</w:t>
+      </w:r>
+      <w:proofErr w:type="spellEnd"/>
+      <w:r>
+        <w:rPr>
+          <w:rFonts w:ascii="Arial" w:hAnsi="Arial" w:cs="Arial"/>
+          <w:lang w:val="es-CO"/>
+        </w:rPr>
+        <w:t>, según sea necesario,</w:t>
+      </w:r>
+      <w:r>
+        <w:rPr>
+          <w:rFonts w:ascii="Arial" w:hAnsi="Arial" w:cs="Arial"/>
+          <w:lang w:val="es-CO"/>
+        </w:rPr>
+        <w:t xml:space="preserve"> a partir de los datos suministrados por el Departamento Nacional de Estadística (DANE), que contenga solo la información correspondiente al municipio de Viterbo, Caldas</w:t>
+      </w:r>
+      <w:r>
+        <w:rPr>
+          <w:rFonts w:ascii="Arial" w:hAnsi="Arial" w:cs="Arial"/>
+          <w:lang w:val="es-CO"/>
+        </w:rPr>
+        <w:t>.</w:t>
+      </w:r>
+    </w:p>
+    <w:p>
+      <w:pPr>
+        <w:rPr>
+          <w:rFonts w:ascii="Arial" w:hAnsi="Arial" w:cs="Arial"/>
+          <w:lang w:val="es-CO"/>
+        </w:rPr>
+      </w:pPr>
+    </w:p>
+    <w:p>
+      <w:pPr>
         <w:rPr>
           <w:rFonts w:ascii="Arial" w:hAnsi="Arial" w:cs="Arial"/>
           <w:b/>
           <w:bCs/>
           <w:lang w:val="es-CO"/>
         </w:rPr>
-        <w:t>Miembros del proyecto</w:t>
-      </w:r>
-    </w:p>
-    <w:p>
-      <w:pPr>
-        <w:rPr>
-          <w:rFonts w:ascii="Arial" w:hAnsi="Arial" w:cs="Arial"/>
-          <w:lang w:val="es-CO"/>
-        </w:rPr>
-      </w:pPr>
-      <w:r>
-        <w:rPr>
-          <w:rFonts w:ascii="Arial" w:hAnsi="Arial" w:cs="Arial"/>
-          <w:lang w:val="es-CO"/>
-        </w:rPr>
-        <w:t>Para la fecha 23 de febrero de 2025, el proyecto solo cuenta con un integrante, no se descarta la adición de cualquier persona interesada en colaborar.</w:t>
-      </w:r>
-    </w:p>
-    <w:p>
-      <w:pPr>
-        <w:rPr>
-          <w:rFonts w:ascii="Arial" w:hAnsi="Arial" w:cs="Arial"/>
-          <w:lang w:val="es-CO"/>
-        </w:rPr>
-      </w:pPr>
-    </w:p>
-    <w:p>
-      <w:pPr>
+      </w:pPr>
+      <w:r>
         <w:rPr>
           <w:rFonts w:ascii="Arial" w:hAnsi="Arial" w:cs="Arial"/>
           <w:b/>
           <w:bCs/>
           <w:lang w:val="es-CO"/>
         </w:rPr>
-      </w:pPr>
-      <w:r>
+        <w:t>Miembros del proyecto</w:t>
+      </w:r>
+    </w:p>
+    <w:p>
+      <w:pPr>
+        <w:rPr>
+          <w:rFonts w:ascii="Arial" w:hAnsi="Arial" w:cs="Arial"/>
+          <w:lang w:val="es-CO"/>
+        </w:rPr>
+      </w:pPr>
+      <w:r>
+        <w:rPr>
+          <w:rFonts w:ascii="Arial" w:hAnsi="Arial" w:cs="Arial"/>
+          <w:lang w:val="es-CO"/>
+        </w:rPr>
+        <w:t>Para la fecha 23 de febrero de 2025, el proyecto solo cuenta con un integrante, no se descarta la adición de cualquier persona interesada en colaborar.</w:t>
+      </w:r>
+    </w:p>
+    <w:p>
+      <w:pPr>
+        <w:rPr>
+          <w:rFonts w:ascii="Arial" w:hAnsi="Arial" w:cs="Arial"/>
+          <w:lang w:val="es-CO"/>
+        </w:rPr>
+      </w:pPr>
+    </w:p>
+    <w:p>
+      <w:pPr>
         <w:rPr>
           <w:rFonts w:ascii="Arial" w:hAnsi="Arial" w:cs="Arial"/>
           <w:b/>
           <w:bCs/>
           <w:lang w:val="es-CO"/>
         </w:rPr>
+      </w:pPr>
+      <w:r>
+        <w:rPr>
+          <w:rFonts w:ascii="Arial" w:hAnsi="Arial" w:cs="Arial"/>
+          <w:b/>
+          <w:bCs/>
+          <w:lang w:val="es-CO"/>
+        </w:rPr>
         <w:t>Alcance</w:t>
       </w:r>
     </w:p>
@@ -349,7 +397,23 @@
           <w:rFonts w:ascii="Arial" w:hAnsi="Arial" w:cs="Arial"/>
           <w:lang w:val="es-CO"/>
         </w:rPr>
-        <w:t>Este proyecto solo se tratará de la construcción del o los datasets, el proyecto no contempla ningún análisis sobre los datos.</w:t>
+        <w:t xml:space="preserve">Este proyecto solo se tratará de la construcción del o los </w:t>
+      </w:r>
+      <w:proofErr w:type="spellStart"/>
+      <w:r>
+        <w:rPr>
+          <w:rFonts w:ascii="Arial" w:hAnsi="Arial" w:cs="Arial"/>
+          <w:lang w:val="es-CO"/>
+        </w:rPr>
+        <w:t>datasets</w:t>
+      </w:r>
+      <w:proofErr w:type="spellEnd"/>
+      <w:r>
+        <w:rPr>
+          <w:rFonts w:ascii="Arial" w:hAnsi="Arial" w:cs="Arial"/>
+          <w:lang w:val="es-CO"/>
+        </w:rPr>
+        <w:t>, el proyecto no contempla ningún análisis sobre los datos.</w:t>
       </w:r>
     </w:p>
     <w:p>
@@ -984,6 +1048,7 @@
   <w:style w:type="character" w:default="1" w:styleId="Fuentedeprrafopredeter">
     <w:name w:val="Default Paragraph Font"/>
     <w:uiPriority w:val="1"/>
+    <w:semiHidden/>
     <w:unhideWhenUsed/>
   </w:style>
   <w:style w:type="table" w:default="1" w:styleId="Tablanormal">

</xml_diff>

<commit_message>
Actualiza objetivo en descripcion del proyecto
</commit_message>
<xml_diff>
--- a/Documentacion/Descripción del Proyecto.docx
+++ b/Documentacion/Descripción del Proyecto.docx
@@ -1,6 +1,6 @@
 
 <file path=word/document.xml><?xml version="1.0" encoding="utf-8"?>
-<w:document xmlns:wpc="http://schemas.microsoft.com/office/word/2010/wordprocessingCanvas" xmlns:cx="http://schemas.microsoft.com/office/drawing/2014/chartex" xmlns:cx1="http://schemas.microsoft.com/office/drawing/2015/9/8/chartex" xmlns:cx2="http://schemas.microsoft.com/office/drawing/2015/10/21/chartex" xmlns:cx3="http://schemas.microsoft.com/office/drawing/2016/5/9/chartex" xmlns:cx4="http://schemas.microsoft.com/office/drawing/2016/5/10/chartex" xmlns:cx5="http://schemas.microsoft.com/office/drawing/2016/5/11/chartex" xmlns:cx6="http://schemas.microsoft.com/office/drawing/2016/5/12/chartex" xmlns:cx7="http://schemas.microsoft.com/office/drawing/2016/5/13/chartex" xmlns:cx8="http://schemas.microsoft.com/office/drawing/2016/5/14/chartex" xmlns:mc="http://schemas.openxmlformats.org/markup-compatibility/2006" xmlns:aink="http://schemas.microsoft.com/office/drawing/2016/ink" xmlns:am3d="http://schemas.microsoft.com/office/drawing/2017/model3d" xmlns:o="urn:schemas-microsoft-com:office:office" xmlns:oel="http://schemas.microsoft.com/office/2019/extlst" xmlns:r="http://schemas.openxmlformats.org/officeDocument/2006/relationships" xmlns:m="http://schemas.openxmlformats.org/officeDocument/2006/math" xmlns:v="urn:schemas-microsoft-com:vml" xmlns:wp14="http://schemas.microsoft.com/office/word/2010/wordprocessingDrawing" xmlns:wp="http://schemas.openxmlformats.org/drawingml/2006/wordprocessingDrawing" xmlns:w10="urn:schemas-microsoft-com:office:word" xmlns:w="http://schemas.openxmlformats.org/wordprocessingml/2006/main" xmlns:w14="http://schemas.microsoft.com/office/word/2010/wordml" xmlns:w15="http://schemas.microsoft.com/office/word/2012/wordml" xmlns:w16cex="http://schemas.microsoft.com/office/word/2018/wordml/cex" xmlns:w16cid="http://schemas.microsoft.com/office/word/2016/wordml/cid" xmlns:w16="http://schemas.microsoft.com/office/word/2018/wordml" xmlns:w16du="http://schemas.microsoft.com/office/word/2023/wordml/word16du" xmlns:w16sdtdh="http://schemas.microsoft.com/office/word/2020/wordml/sdtdatahash" xmlns:w16sdtfl="http://schemas.microsoft.com/office/word/2024/wordml/sdtformatlock" xmlns:w16se="http://schemas.microsoft.com/office/word/2015/wordml/symex" xmlns:wpg="http://schemas.microsoft.com/office/word/2010/wordprocessingGroup" xmlns:wpi="http://schemas.microsoft.com/office/word/2010/wordprocessingInk" xmlns:wne="http://schemas.microsoft.com/office/word/2006/wordml" xmlns:wps="http://schemas.microsoft.com/office/word/2010/wordprocessingShape" mc:Ignorable="w14 w15 w16se w16cid w16 w16cex w16sdtdh w16sdtfl w16du wp14">
+<w:document xmlns:wpc="http://schemas.microsoft.com/office/word/2010/wordprocessingCanvas" xmlns:cx="http://schemas.microsoft.com/office/drawing/2014/chartex" xmlns:cx1="http://schemas.microsoft.com/office/drawing/2015/9/8/chartex" xmlns:cx2="http://schemas.microsoft.com/office/drawing/2015/10/21/chartex" xmlns:cx3="http://schemas.microsoft.com/office/drawing/2016/5/9/chartex" xmlns:cx4="http://schemas.microsoft.com/office/drawing/2016/5/10/chartex" xmlns:cx5="http://schemas.microsoft.com/office/drawing/2016/5/11/chartex" xmlns:cx6="http://schemas.microsoft.com/office/drawing/2016/5/12/chartex" xmlns:cx7="http://schemas.microsoft.com/office/drawing/2016/5/13/chartex" xmlns:cx8="http://schemas.microsoft.com/office/drawing/2016/5/14/chartex" xmlns:mc="http://schemas.openxmlformats.org/markup-compatibility/2006" xmlns:aink="http://schemas.microsoft.com/office/drawing/2016/ink" xmlns:am3d="http://schemas.microsoft.com/office/drawing/2017/model3d" xmlns:o="urn:schemas-microsoft-com:office:office" xmlns:r="http://schemas.openxmlformats.org/officeDocument/2006/relationships" xmlns:m="http://schemas.openxmlformats.org/officeDocument/2006/math" xmlns:v="urn:schemas-microsoft-com:vml" xmlns:wp14="http://schemas.microsoft.com/office/word/2010/wordprocessingDrawing" xmlns:wp="http://schemas.openxmlformats.org/drawingml/2006/wordprocessingDrawing" xmlns:w10="urn:schemas-microsoft-com:office:word" xmlns:w="http://schemas.openxmlformats.org/wordprocessingml/2006/main" xmlns:w14="http://schemas.microsoft.com/office/word/2010/wordml" xmlns:w15="http://schemas.microsoft.com/office/word/2012/wordml" xmlns:w16cex="http://schemas.microsoft.com/office/word/2018/wordml/cex" xmlns:w16cid="http://schemas.microsoft.com/office/word/2016/wordml/cid" xmlns:w16="http://schemas.microsoft.com/office/word/2018/wordml" xmlns:w16sdtdh="http://schemas.microsoft.com/office/word/2020/wordml/sdtdatahash" xmlns:w16se="http://schemas.microsoft.com/office/word/2015/wordml/symex" xmlns:wpg="http://schemas.microsoft.com/office/word/2010/wordprocessingGroup" xmlns:wpi="http://schemas.microsoft.com/office/word/2010/wordprocessingInk" xmlns:wne="http://schemas.microsoft.com/office/word/2006/wordml" xmlns:wps="http://schemas.microsoft.com/office/word/2010/wordprocessingShape" mc:Ignorable="w14 w15 w16se w16cid w16 w16cex w16sdtdh wp14">
   <w:body>
     <w:p>
       <w:pPr>
@@ -111,21 +111,14 @@
           <w:rFonts w:ascii="Arial" w:hAnsi="Arial" w:cs="Arial"/>
           <w:lang w:val="es-CO"/>
         </w:rPr>
-        <w:t>2</w:t>
-      </w:r>
-      <w:r>
-        <w:rPr>
-          <w:rFonts w:ascii="Arial" w:hAnsi="Arial" w:cs="Arial"/>
-          <w:lang w:val="es-CO"/>
-        </w:rPr>
-        <w:t>4</w:t>
-      </w:r>
-      <w:r>
-        <w:rPr>
-          <w:rFonts w:ascii="Arial" w:hAnsi="Arial" w:cs="Arial"/>
-          <w:lang w:val="es-CO"/>
-        </w:rPr>
-        <w:t xml:space="preserve"> de febrero de 2025</w:t>
+        <w:t xml:space="preserve">2 de octubre de </w:t>
+      </w:r>
+      <w:r>
+        <w:rPr>
+          <w:rFonts w:ascii="Arial" w:hAnsi="Arial" w:cs="Arial"/>
+          <w:lang w:val="es-CO"/>
+        </w:rPr>
+        <w:t>2025</w:t>
       </w:r>
     </w:p>
     <w:p>
@@ -254,51 +247,7 @@
           <w:rFonts w:ascii="Arial" w:hAnsi="Arial" w:cs="Arial"/>
           <w:lang w:val="es-CO"/>
         </w:rPr>
-        <w:t>Construir un</w:t>
-      </w:r>
-      <w:r>
-        <w:rPr>
-          <w:rFonts w:ascii="Arial" w:hAnsi="Arial" w:cs="Arial"/>
-          <w:lang w:val="es-CO"/>
-        </w:rPr>
-        <w:t>o o varios</w:t>
-      </w:r>
-      <w:r>
-        <w:rPr>
-          <w:rFonts w:ascii="Arial" w:hAnsi="Arial" w:cs="Arial"/>
-          <w:lang w:val="es-CO"/>
-        </w:rPr>
-        <w:t xml:space="preserve"> </w:t>
-      </w:r>
-      <w:proofErr w:type="spellStart"/>
-      <w:r>
-        <w:rPr>
-          <w:rFonts w:ascii="Arial" w:hAnsi="Arial" w:cs="Arial"/>
-          <w:lang w:val="es-CO"/>
-        </w:rPr>
-        <w:t>dataset</w:t>
-      </w:r>
-      <w:proofErr w:type="spellEnd"/>
-      <w:r>
-        <w:rPr>
-          <w:rFonts w:ascii="Arial" w:hAnsi="Arial" w:cs="Arial"/>
-          <w:lang w:val="es-CO"/>
-        </w:rPr>
-        <w:t>, según sea necesario,</w:t>
-      </w:r>
-      <w:r>
-        <w:rPr>
-          <w:rFonts w:ascii="Arial" w:hAnsi="Arial" w:cs="Arial"/>
-          <w:lang w:val="es-CO"/>
-        </w:rPr>
-        <w:t xml:space="preserve"> a partir de los datos suministrados por el Departamento Nacional de Estadística (DANE), que contenga solo la información correspondiente al municipio de Viterbo, Caldas</w:t>
-      </w:r>
-      <w:r>
-        <w:rPr>
-          <w:rFonts w:ascii="Arial" w:hAnsi="Arial" w:cs="Arial"/>
-          <w:lang w:val="es-CO"/>
-        </w:rPr>
-        <w:t>.</w:t>
+        <w:t>Poner a disposición del público general una versión de fácil acceso a los datos del Censo Nacional de Población y Vivienda en Colombia del año 2018 del municipio de Viterbo Caldas.</w:t>
       </w:r>
     </w:p>
     <w:p>
@@ -446,7 +395,7 @@
 </file>
 
 <file path=word/styles.xml><?xml version="1.0" encoding="utf-8"?>
-<w:styles xmlns:mc="http://schemas.openxmlformats.org/markup-compatibility/2006" xmlns:r="http://schemas.openxmlformats.org/officeDocument/2006/relationships" xmlns:w="http://schemas.openxmlformats.org/wordprocessingml/2006/main" xmlns:w14="http://schemas.microsoft.com/office/word/2010/wordml" xmlns:w15="http://schemas.microsoft.com/office/word/2012/wordml" xmlns:w16cex="http://schemas.microsoft.com/office/word/2018/wordml/cex" xmlns:w16cid="http://schemas.microsoft.com/office/word/2016/wordml/cid" xmlns:w16="http://schemas.microsoft.com/office/word/2018/wordml" xmlns:w16du="http://schemas.microsoft.com/office/word/2023/wordml/word16du" xmlns:w16sdtdh="http://schemas.microsoft.com/office/word/2020/wordml/sdtdatahash" xmlns:w16sdtfl="http://schemas.microsoft.com/office/word/2024/wordml/sdtformatlock" xmlns:w16se="http://schemas.microsoft.com/office/word/2015/wordml/symex" mc:Ignorable="w14 w15 w16se w16cid w16 w16cex w16sdtdh w16sdtfl w16du">
+<w:styles xmlns:mc="http://schemas.openxmlformats.org/markup-compatibility/2006" xmlns:r="http://schemas.openxmlformats.org/officeDocument/2006/relationships" xmlns:w="http://schemas.openxmlformats.org/wordprocessingml/2006/main" xmlns:w14="http://schemas.microsoft.com/office/word/2010/wordml" xmlns:w15="http://schemas.microsoft.com/office/word/2012/wordml" xmlns:w16cex="http://schemas.microsoft.com/office/word/2018/wordml/cex" xmlns:w16cid="http://schemas.microsoft.com/office/word/2016/wordml/cid" xmlns:w16="http://schemas.microsoft.com/office/word/2018/wordml" xmlns:w16sdtdh="http://schemas.microsoft.com/office/word/2020/wordml/sdtdatahash" xmlns:w16se="http://schemas.microsoft.com/office/word/2015/wordml/symex" mc:Ignorable="w14 w15 w16se w16cid w16 w16cex w16sdtdh">
   <w:docDefaults>
     <w:rPrDefault>
       <w:rPr>

</xml_diff>